<commit_message>
Condense project description to fit one page
Tighter margins, 10.5pt font, 1.1 line spacing, shorter paragraphs.
Same content coverage: problem, what we built, 4 tradeoffs, evaluation.

Co-Authored-By: Claude Opus 4.6 (1M context) <noreply@anthropic.com>
</commit_message>
<xml_diff>
--- a/project-docs/OIT277_Project_Description.docx
+++ b/project-docs/OIT277_Project_Description.docx
@@ -9,7 +9,7 @@
       <w:r>
         <w:rPr>
           <w:b/>
-          <w:sz w:val="28"/>
+          <w:sz w:val="26"/>
         </w:rPr>
         <w:t>NBA Trade Matcher: Multi-Team Trade Discovery via Top Trading Cycles</w:t>
       </w:r>
@@ -20,7 +20,7 @@
       </w:pPr>
       <w:r>
         <w:rPr>
-          <w:sz w:val="20"/>
+          <w:sz w:val="19"/>
         </w:rPr>
         <w:t>David Lee, Tyson Fenay, Ryley Mehta — OIT 277, Spring 2026</w:t>
       </w:r>
@@ -29,37 +29,37 @@
       <w:r>
         <w:rPr>
           <w:b/>
-          <w:sz w:val="24"/>
+          <w:sz w:val="22"/>
         </w:rPr>
         <w:t>The Problem</w:t>
       </w:r>
     </w:p>
     <w:p>
       <w:r>
-        <w:t>Professional sports leagues systematically under-produce multi-team trades, even when such deals would create value for all parties involved. The core coordination failure is bilateral: Team A wants what Team B has, but B has no interest in what A offers. A third party could complete the deal, but discovering that third party through phone calls is slow, information-leaky, and does not scale. The result is a market that leaves significant value on the table.</w:t>
+        <w:t>Multi-team NBA trades create value but rarely happen. The coordination failure is bilateral: Team A wants what Team B has, but B has no interest in A's offer. A third party could complete the deal, but discovering that party through phone calls is slow, leaks information, and doesn't scale.</w:t>
       </w:r>
     </w:p>
     <w:p>
       <w:r>
         <w:rPr>
           <w:b/>
-          <w:sz w:val="24"/>
+          <w:sz w:val="22"/>
         </w:rPr>
         <w:t>What We Built</w:t>
       </w:r>
     </w:p>
     <w:p>
       <w:r>
-        <w:t>NBA Trade Matcher is a platform prototype that surfaces multi-team trade opportunities across all 30 NBA teams using the Top Trading Cycles (TTC) algorithm. The system runs a six-stage pipeline: (1) pull live per-game stats for ~458 NBA players via the nba_api package; (2) classify each player into one of eight role archetypes (Floor Spacer, Rim Protector, Playmaker, Paint Scorer, Two-Way Wing, Stretch Big, Defensive Anchor, Volume Scorer) using rule-based stat thresholds; (3) compute team-specific roster gaps by comparing each team's role composition to an ideal adjusted by their statistical profile; (4) generate preference rankings where each team scores every player on every other team by how well they fill roster needs; (5) run the TTC algorithm on a multi-edge preference graph to discover stable trading cycles of up to 6 teams; and (6) generate trade narratives using GPT-4o to explain why each deal makes sense in ESPN analyst style. The prototype is a Streamlit web app with five tabs: a pipeline walkthrough, league dashboard, team explorer, trade cycle viewer with AI-generated narratives, and an AI evaluation page.</w:t>
+        <w:t>A Streamlit web app that surfaces multi-team trade opportunities across all 30 NBA teams using a six-stage pipeline: (1) pull live per-game stats for ~458 players via nba_api; (2) classify players into 8 role archetypes using stat thresholds; (3) compute team-specific roster gaps adjusted by each team's statistical profile; (4) rank every available player by how well they fill each team's needs; (5) run the Top Trading Cycles algorithm on a multi-edge preference graph to find stable cycles of up to 6 teams; (6) generate ESPN-style trade narratives via GPT-4o. On default settings, the system finds 5 trade cycles — all multi-team — involving all 30 teams.</w:t>
       </w:r>
     </w:p>
     <w:p>
       <w:r>
         <w:rPr>
           <w:b/>
-          <w:sz w:val="24"/>
+          <w:sz w:val="22"/>
         </w:rPr>
-        <w:t>Design Tradeoffs and Our Choices</w:t>
+        <w:t>Design Tradeoffs</w:t>
       </w:r>
     </w:p>
     <w:p>
@@ -67,10 +67,10 @@
         <w:rPr>
           <w:b/>
         </w:rPr>
-        <w:t xml:space="preserve">Stability vs. global optimality. </w:t>
+        <w:t xml:space="preserve">Stability vs. optimality: </w:t>
       </w:r>
       <w:r>
-        <w:t>TTC guarantees individual rationality — no team in a completed cycle would prefer to undo the trade. It does not guarantee the globally optimal configuration across all possible trades. We chose stability because in a voluntary market, a deal every party agrees to is more valuable than a theoretically superior deal that any party could veto.</w:t>
+        <w:t>TTC guarantees no team would undo their trade (individual rationality) but not the globally optimal configuration. In a voluntary market, a deal every party agrees to beats a theoretically better deal that someone vetoes.</w:t>
       </w:r>
     </w:p>
     <w:p>
@@ -78,10 +78,10 @@
         <w:rPr>
           <w:b/>
         </w:rPr>
-        <w:t xml:space="preserve">Multi-edge graph vs. single-pointer TTC. </w:t>
+        <w:t xml:space="preserve">Multi-edge vs. single-pointer graph: </w:t>
       </w:r>
       <w:r>
-        <w:t>Our initial implementation used a classical single-pointer graph (one outgoing edge per team), which produced almost exclusively 2-team swaps — 17 of 30 teams pointed at the same target. We switched to a multi-edge preference graph (top 5 teams per team) with longest-cycle-first selection. This was the critical design iteration that unlocked multi-team trades involving 5-6 teams.</w:t>
+        <w:t>Our initial single-pointer TTC produced only 2-team swaps — 17 of 30 teams pointed at the same target. Switching to a multi-edge graph (top 5 preferences per team) with longest-cycle-first selection unlocked the multi-team trades that are the platform's core value.</w:t>
       </w:r>
     </w:p>
     <w:p>
@@ -89,10 +89,10 @@
         <w:rPr>
           <w:b/>
         </w:rPr>
-        <w:t xml:space="preserve">Rule-based roles vs. ML classification. </w:t>
+        <w:t xml:space="preserve">Rule-based roles vs. ML: </w:t>
       </w:r>
       <w:r>
-        <w:t>We use hand-tuned stat thresholds rather than machine learning for role classification. The tradeoff: ~50% of players fall into a generic "Rotation Player" bucket, but every classification is transparent and explainable — we can point to exact stats and thresholds. This was the right call given the 10-day project timeline and the evaluation rubric's emphasis on understanding where AI fails.</w:t>
+        <w:t>Hand-tuned stat thresholds over ML classification. ~50% of players default to "Rotation Player," but every classification is transparent and explainable — the right call given the project timeline.</w:t>
       </w:r>
     </w:p>
     <w:p>
@@ -100,17 +100,17 @@
         <w:rPr>
           <w:b/>
         </w:rPr>
-        <w:t xml:space="preserve">GPT-4o narratives vs. templates. </w:t>
+        <w:t xml:space="preserve">GPT-4o vs. templates: </w:t>
       </w:r>
       <w:r>
-        <w:t>We initially used template-based narratives (zero hallucination risk, deterministic), then added GPT-4o for richer, more varied trade analysis. The tradeoff is a small risk of hallucination and API dependency, but the quality improvement for a demo audience is significant. The app falls back to templates when no API key is provided.</w:t>
+        <w:t>We added GPT-4o narratives over the original template approach for richer trade analysis, accepting a small hallucination risk. The app falls back to templates without an API key.</w:t>
       </w:r>
     </w:p>
     <w:p>
       <w:r>
         <w:rPr>
           <w:b/>
-          <w:sz w:val="24"/>
+          <w:sz w:val="22"/>
         </w:rPr>
         <w:t>Evaluation</w:t>
       </w:r>
@@ -120,10 +120,10 @@
         <w:rPr>
           <w:b/>
         </w:rPr>
-        <w:t xml:space="preserve">Where it works: </w:t>
+        <w:t xml:space="preserve">Works well: </w:t>
       </w:r>
       <w:r>
-        <w:t>The system reliably surfaces multi-team trades that bilateral negotiation could not discover. On default settings it finds 5 trade cycles — all multi-team (four 6-team, one 5-team) — involving all 30 NBA teams. Role classification passes the eye test for clear archetypes (Curry → Floor Spacer, Gobert → Rim Protector, AD → Rim Protector). Team-specific gap analysis correctly identifies roster weaknesses and creates the preference diversity needed for complex cycles.</w:t>
+        <w:t>Reliably finds multi-team trades (5-6 teams each) that bilateral negotiation cannot discover. Role classification passes the eye test for clear archetypes. Team-specific gap analysis creates the preference diversity needed for complex cycles to emerge.</w:t>
       </w:r>
     </w:p>
     <w:p>
@@ -131,15 +131,15 @@
         <w:rPr>
           <w:b/>
         </w:rPr>
-        <w:t xml:space="preserve">Where it falls short: </w:t>
+        <w:t xml:space="preserve">Falls short: </w:t>
       </w:r>
       <w:r>
-        <w:t>Half the league is classified as "Rotation Player" — the system cannot distinguish between meaningfully different bench players who lack standout stats. Team strategy adjustments are based on aggregate stats, not coaching philosophy or scheme fit. Real trade decisions depend on factors we do not model: salary cap, contract status, injury history, age, draft pick compensation, and locker room chemistry. The system is best understood as a coordination tool that augments human judgment, not one that replaces it.</w:t>
+        <w:t>Half the league gets "Rotation Player" — the system can't distinguish bench players without standout stats. Team strategy is based on aggregate stats, not coaching philosophy. Factors real GMs weigh heavily — salary cap, contracts, injury history, chemistry — are not modeled. The system augments human judgment; it does not replace it.</w:t>
       </w:r>
     </w:p>
     <w:sectPr>
       <w:pgSz w:w="12240" w:h="15840"/>
-      <w:pgMar w:top="1008" w:right="1152" w:bottom="1008" w:left="1152" w:header="720" w:footer="720" w:gutter="0"/>
+      <w:pgMar w:top="864" w:right="1008" w:bottom="720" w:left="1008" w:header="720" w:footer="720" w:gutter="0"/>
       <w:cols w:space="720"/>
       <w:docGrid w:linePitch="360"/>
     </w:sectPr>
@@ -510,9 +510,12 @@
     <w:name w:val="Normal"/>
     <w:qFormat/>
     <w:rsid w:val="00FC693F"/>
+    <w:pPr>
+      <w:spacing w:after="80" w:before="0" w:line="264" w:lineRule="auto"/>
+    </w:pPr>
     <w:rPr>
       <w:rFonts w:ascii="Calibri" w:hAnsi="Calibri"/>
-      <w:sz w:val="22"/>
+      <w:sz w:val="21"/>
     </w:rPr>
   </w:style>
   <w:style w:type="paragraph" w:styleId="Header">

</xml_diff>

<commit_message>
Shorten project description, remove em dashes
Same 11pt Calibri formatting, roughly half the word count.
No em dashes anywhere.

Co-Authored-By: Claude Opus 4.6 (1M context) <noreply@anthropic.com>
</commit_message>
<xml_diff>
--- a/project-docs/OIT277_Project_Description.docx
+++ b/project-docs/OIT277_Project_Description.docx
@@ -9,7 +9,7 @@
       <w:r>
         <w:rPr>
           <w:b/>
-          <w:sz w:val="26"/>
+          <w:sz w:val="28"/>
         </w:rPr>
         <w:t>NBA Trade Matcher: Multi-Team Trade Discovery via Top Trading Cycles</w:t>
       </w:r>
@@ -20,44 +20,44 @@
       </w:pPr>
       <w:r>
         <w:rPr>
-          <w:sz w:val="19"/>
+          <w:sz w:val="20"/>
         </w:rPr>
-        <w:t>David Lee, Tyson Fenay, Ryley Mehta — OIT 277, Spring 2026</w:t>
+        <w:t>David Lee, Tyson Fenay, Ryley Mehta | OIT 277, Spring 2026</w:t>
       </w:r>
     </w:p>
     <w:p>
       <w:r>
         <w:rPr>
           <w:b/>
-          <w:sz w:val="22"/>
+          <w:sz w:val="24"/>
         </w:rPr>
         <w:t>The Problem</w:t>
       </w:r>
     </w:p>
     <w:p>
       <w:r>
-        <w:t>Multi-team NBA trades create value but rarely happen. The coordination failure is bilateral: Team A wants what Team B has, but B has no interest in A's offer. A third party could complete the deal, but discovering that party through phone calls is slow, leaks information, and doesn't scale.</w:t>
+        <w:t>Multi-team NBA trades create value but rarely happen because bilateral negotiation cannot coordinate three or more parties simultaneously. A platform that aggregates team preferences and discovers mutually beneficial cycles could unlock trades that phone calls never surface.</w:t>
       </w:r>
     </w:p>
     <w:p>
       <w:r>
         <w:rPr>
           <w:b/>
-          <w:sz w:val="22"/>
+          <w:sz w:val="24"/>
         </w:rPr>
         <w:t>What We Built</w:t>
       </w:r>
     </w:p>
     <w:p>
       <w:r>
-        <w:t>A Streamlit web app that surfaces multi-team trade opportunities across all 30 NBA teams using a six-stage pipeline: (1) pull live per-game stats for ~458 players via nba_api; (2) classify players into 8 role archetypes using stat thresholds; (3) compute team-specific roster gaps adjusted by each team's statistical profile; (4) rank every available player by how well they fill each team's needs; (5) run the Top Trading Cycles algorithm on a multi-edge preference graph to find stable cycles of up to 6 teams; (6) generate ESPN-style trade narratives via GPT-4o. On default settings, the system finds 5 trade cycles — all multi-team — involving all 30 teams.</w:t>
+        <w:t>A Streamlit web app that runs a six-stage pipeline: pull live NBA stats for ~458 players, classify each into one of 8 role archetypes, compute team-specific roster gaps, rank every available player by how well they fill each team's needs, run the Top Trading Cycles algorithm to find stable multi-team cycles, and generate trade narratives via GPT-4o. On default settings the system finds 5 trade cycles, all multi-team (up to 6 teams each), involving all 30 NBA teams.</w:t>
       </w:r>
     </w:p>
     <w:p>
       <w:r>
         <w:rPr>
           <w:b/>
-          <w:sz w:val="22"/>
+          <w:sz w:val="24"/>
         </w:rPr>
         <w:t>Design Tradeoffs</w:t>
       </w:r>
@@ -67,10 +67,10 @@
         <w:rPr>
           <w:b/>
         </w:rPr>
-        <w:t xml:space="preserve">Stability vs. optimality: </w:t>
+        <w:t xml:space="preserve">Stability vs. optimality. </w:t>
       </w:r>
       <w:r>
-        <w:t>TTC guarantees no team would undo their trade (individual rationality) but not the globally optimal configuration. In a voluntary market, a deal every party agrees to beats a theoretically better deal that someone vetoes.</w:t>
+        <w:t>TTC guarantees no team would undo their trade, but does not guarantee the globally optimal outcome. We chose stability because voluntary agreement matters more than theoretical efficiency.</w:t>
       </w:r>
     </w:p>
     <w:p>
@@ -78,10 +78,10 @@
         <w:rPr>
           <w:b/>
         </w:rPr>
-        <w:t xml:space="preserve">Multi-edge vs. single-pointer graph: </w:t>
+        <w:t xml:space="preserve">Multi-edge vs. single-pointer graph. </w:t>
       </w:r>
       <w:r>
-        <w:t>Our initial single-pointer TTC produced only 2-team swaps — 17 of 30 teams pointed at the same target. Switching to a multi-edge graph (top 5 preferences per team) with longest-cycle-first selection unlocked the multi-team trades that are the platform's core value.</w:t>
+        <w:t>Our initial single-pointer TTC produced only 2-team swaps because 17 of 30 teams pointed at the same target. Giving each team edges to their top 5 preferred teams unlocked the multi-team cycles that are the platform's core value.</w:t>
       </w:r>
     </w:p>
     <w:p>
@@ -89,10 +89,10 @@
         <w:rPr>
           <w:b/>
         </w:rPr>
-        <w:t xml:space="preserve">Rule-based roles vs. ML: </w:t>
+        <w:t xml:space="preserve">Rule-based roles vs. ML. </w:t>
       </w:r>
       <w:r>
-        <w:t>Hand-tuned stat thresholds over ML classification. ~50% of players default to "Rotation Player," but every classification is transparent and explainable — the right call given the project timeline.</w:t>
+        <w:t>Hand-tuned stat thresholds mean ~50% of players default to "Rotation Player," but every classification is transparent and explainable.</w:t>
       </w:r>
     </w:p>
     <w:p>
@@ -100,17 +100,17 @@
         <w:rPr>
           <w:b/>
         </w:rPr>
-        <w:t xml:space="preserve">GPT-4o vs. templates: </w:t>
+        <w:t xml:space="preserve">GPT-4o vs. template narratives. </w:t>
       </w:r>
       <w:r>
-        <w:t>We added GPT-4o narratives over the original template approach for richer trade analysis, accepting a small hallucination risk. The app falls back to templates without an API key.</w:t>
+        <w:t>GPT-4o produces richer trade analysis at the cost of a small hallucination risk. The app falls back to deterministic templates without an API key.</w:t>
       </w:r>
     </w:p>
     <w:p>
       <w:r>
         <w:rPr>
           <w:b/>
-          <w:sz w:val="22"/>
+          <w:sz w:val="24"/>
         </w:rPr>
         <w:t>Evaluation</w:t>
       </w:r>
@@ -123,7 +123,7 @@
         <w:t xml:space="preserve">Works well: </w:t>
       </w:r>
       <w:r>
-        <w:t>Reliably finds multi-team trades (5-6 teams each) that bilateral negotiation cannot discover. Role classification passes the eye test for clear archetypes. Team-specific gap analysis creates the preference diversity needed for complex cycles to emerge.</w:t>
+        <w:t>Reliably finds multi-team trades that bilateral negotiation cannot discover. Role classification passes the eye test for clear archetypes (Curry as Floor Spacer, Gobert as Rim Protector). Team-specific gap analysis creates diverse preferences that drive complex cycles.</w:t>
       </w:r>
     </w:p>
     <w:p>
@@ -134,12 +134,12 @@
         <w:t xml:space="preserve">Falls short: </w:t>
       </w:r>
       <w:r>
-        <w:t>Half the league gets "Rotation Player" — the system can't distinguish bench players without standout stats. Team strategy is based on aggregate stats, not coaching philosophy. Factors real GMs weigh heavily — salary cap, contracts, injury history, chemistry — are not modeled. The system augments human judgment; it does not replace it.</w:t>
+        <w:t>Cannot distinguish bench players without standout stats. Does not model salary cap, contracts, injury history, or coaching scheme. The system augments human judgment rather than replacing it.</w:t>
       </w:r>
     </w:p>
     <w:sectPr>
       <w:pgSz w:w="12240" w:h="15840"/>
-      <w:pgMar w:top="864" w:right="1008" w:bottom="720" w:left="1008" w:header="720" w:footer="720" w:gutter="0"/>
+      <w:pgMar w:top="1008" w:right="1152" w:bottom="1008" w:left="1152" w:header="720" w:footer="720" w:gutter="0"/>
       <w:cols w:space="720"/>
       <w:docGrid w:linePitch="360"/>
     </w:sectPr>
@@ -510,12 +510,9 @@
     <w:name w:val="Normal"/>
     <w:qFormat/>
     <w:rsid w:val="00FC693F"/>
-    <w:pPr>
-      <w:spacing w:after="80" w:before="0" w:line="264" w:lineRule="auto"/>
-    </w:pPr>
     <w:rPr>
       <w:rFonts w:ascii="Calibri" w:hAnsi="Calibri"/>
-      <w:sz w:val="21"/>
+      <w:sz w:val="22"/>
     </w:rPr>
   </w:style>
   <w:style w:type="paragraph" w:styleId="Header">

</xml_diff>